<commit_message>
Update 9/11 homework: Math workbook P.11, Chinese A-book P.11, Chinese B-book L2 characters (Quan~Si) x5, and Chinese L1 dictation test
</commit_message>
<xml_diff>
--- a/115學年度上學期興華國小二年甲班親師座談會家長日書面資料.docx
+++ b/115學年度上學期興華國小二年甲班親師座談會家長日書面資料.docx
@@ -64,6 +64,46 @@
       <w:pPr>
         <w:spacing w:after="160"/>
       </w:pPr>
+    </w:p>
+    <w:p>
+      <w:pPr>
+        <w:spacing w:before="120" w:after="200"/>
+        <w:jc w:val="center"/>
+      </w:pPr>
+      <w:r>
+        <w:drawing>
+          <wp:inline xmlns:a="http://schemas.openxmlformats.org/drawingml/2006/main" xmlns:pic="http://schemas.openxmlformats.org/drawingml/2006/picture">
+            <wp:extent cx="5486400" cy="4115729"/>
+            <wp:docPr id="3" name="Picture 3"/>
+            <wp:cNvGraphicFramePr>
+              <a:graphicFrameLocks noChangeAspect="1"/>
+            </wp:cNvGraphicFramePr>
+            <a:graphic>
+              <a:graphicData uri="http://schemas.openxmlformats.org/drawingml/2006/picture">
+                <pic:pic>
+                  <pic:nvPicPr>
+                    <pic:cNvPr id="0" name="image.jpg"/>
+                    <pic:cNvPicPr/>
+                  </pic:nvPicPr>
+                  <pic:blipFill>
+                    <a:blip r:embed="rId9"/>
+                    <a:stretch>
+                      <a:fillRect/>
+                    </a:stretch>
+                  </pic:blipFill>
+                  <pic:spPr>
+                    <a:xfrm>
+                      <a:off x="0" y="0"/>
+                      <a:ext cx="5486400" cy="4115729"/>
+                    </a:xfrm>
+                    <a:prstGeom prst="rect"/>
+                  </pic:spPr>
+                </pic:pic>
+              </a:graphicData>
+            </a:graphic>
+          </wp:inline>
+        </w:drawing>
+      </w:r>
     </w:p>
     <w:p>
       <w:pPr>
@@ -243,6 +283,45 @@
     </w:p>
     <w:p>
       <w:pPr>
+        <w:jc w:val="center"/>
+      </w:pPr>
+      <w:r>
+        <w:drawing>
+          <wp:inline xmlns:a="http://schemas.openxmlformats.org/drawingml/2006/main" xmlns:pic="http://schemas.openxmlformats.org/drawingml/2006/picture">
+            <wp:extent cx="4114800" cy="3005593"/>
+            <wp:docPr id="4" name="Picture 4"/>
+            <wp:cNvGraphicFramePr>
+              <a:graphicFrameLocks noChangeAspect="1"/>
+            </wp:cNvGraphicFramePr>
+            <a:graphic>
+              <a:graphicData uri="http://schemas.openxmlformats.org/drawingml/2006/picture">
+                <pic:pic>
+                  <pic:nvPicPr>
+                    <pic:cNvPr id="0" name="teacher_photo.png"/>
+                    <pic:cNvPicPr/>
+                  </pic:nvPicPr>
+                  <pic:blipFill>
+                    <a:blip r:embed="rId11"/>
+                    <a:stretch>
+                      <a:fillRect/>
+                    </a:stretch>
+                  </pic:blipFill>
+                  <pic:spPr>
+                    <a:xfrm>
+                      <a:off x="0" y="0"/>
+                      <a:ext cx="4114800" cy="3005593"/>
+                    </a:xfrm>
+                    <a:prstGeom prst="rect"/>
+                  </pic:spPr>
+                </pic:pic>
+              </a:graphicData>
+            </a:graphic>
+          </wp:inline>
+        </w:drawing>
+      </w:r>
+    </w:p>
+    <w:p>
+      <w:pPr>
         <w:spacing w:after="60"/>
         <w:ind w:left="576"/>
       </w:pPr>
@@ -366,7 +445,7 @@
               <w:drawing>
                 <wp:inline xmlns:a="http://schemas.openxmlformats.org/drawingml/2006/main" xmlns:pic="http://schemas.openxmlformats.org/drawingml/2006/picture">
                   <wp:extent cx="1463040" cy="1463040"/>
-                  <wp:docPr id="1" name="Picture 1"/>
+                  <wp:docPr id="2" name="Picture 2"/>
                   <wp:cNvGraphicFramePr>
                     <a:graphicFrameLocks noChangeAspect="1"/>
                   </wp:cNvGraphicFramePr>
@@ -378,7 +457,7 @@
                           <pic:cNvPicPr/>
                         </pic:nvPicPr>
                         <pic:blipFill>
-                          <a:blip r:embed="rId9"/>
+                          <a:blip r:embed="rId10"/>
                           <a:stretch>
                             <a:fillRect/>
                           </a:stretch>

</xml_diff>